<commit_message>
[reporting][subdocs]Fixed templates, comment #639
</commit_message>
<xml_diff>
--- a/reporting/subdocs_templates/table_of_top_threats_by_occurrence_template.docx
+++ b/reporting/subdocs_templates/table_of_top_threats_by_occurrence_template.docx
@@ -4,8 +4,8 @@
   <w:body>
     <w:tbl>
       <w:tblPr>
-        <w:tblpPr w:leftFromText="141" w:rightFromText="141" w:vertAnchor="text" w:horzAnchor="margin" w:tblpXSpec="center" w:tblpY="-61"/>
-        <w:tblW w:w="7976" w:type="dxa"/>
+        <w:tblW w:w="9639" w:type="dxa"/>
+        <w:jc w:val="center"/>
         <w:tblBorders>
           <w:top w:val="single" w:sz="4" w:space="0" w:color="999999"/>
           <w:left w:val="single" w:sz="4" w:space="0" w:color="999999"/>
@@ -18,12 +18,13 @@
         <w:tblLook w:val="04A0" w:firstRow="1" w:lastRow="0" w:firstColumn="1" w:lastColumn="0" w:noHBand="0" w:noVBand="1"/>
       </w:tblPr>
       <w:tblGrid>
-        <w:gridCol w:w="1555"/>
-        <w:gridCol w:w="6421"/>
+        <w:gridCol w:w="1879"/>
+        <w:gridCol w:w="7760"/>
       </w:tblGrid>
       <w:tr>
         <w:trPr>
           <w:trHeight w:val="340"/>
+          <w:jc w:val="center"/>
         </w:trPr>
         <w:tc>
           <w:tcPr>
@@ -111,6 +112,7 @@
       <w:tr>
         <w:trPr>
           <w:trHeight w:val="340"/>
+          <w:jc w:val="center"/>
         </w:trPr>
         <w:tc>
           <w:tcPr>
@@ -282,6 +284,7 @@
       <w:tr>
         <w:trPr>
           <w:trHeight w:val="340"/>
+          <w:jc w:val="center"/>
         </w:trPr>
         <w:tc>
           <w:tcPr>

</xml_diff>